<commit_message>
feat(pricing): rebase diaspora price book ~50% lower (fair + trust-first)
The buyer's care recipient is in Nigeria (same cost base as NGN), a
self-subscribing diaspora member can't use the partner network until
they visit, and a new platform without brand trust can't carry a 6-9x
NGN premium. Now ~2.5-3.5x NGN, still ~80-85% gross margin:

- Essential £15/mo, Complete £29/mo, Premium £49/mo
- ParentCare £59/mo for 2 parents (£590/yr)
- Family Lite £290 / Plus £430 / Premium £620 per year
- USD ~1.3x GBP (//; family //)
- Extra member +£60/£80/£120; extra parent +£19/mo

Marketing GBP tiers, PlanFinder, seed.sql, and the v3 docx guide all
updated in lockstep; new DIASPORA_SELF_USE_NOTE honesty block (labs/
refills/home visits need Nigeria; monitoring works anywhere). NGN
prices deliberately unchanged (analysed fair: Essential = less than
one private GP visit for a month of monitoring, ~50% margin at 1:120).

Co-Authored-By: Claude Fable 5 <noreply@anthropic.com>
</commit_message>
<xml_diff>
--- a/docs/Tarragon_Health_Pricing_Guide_v3.docx
+++ b/docs/Tarragon_Health_Pricing_Guide_v3.docx
@@ -2476,7 +2476,7 @@
                 <w:sz w:val="19"/>
                 <w:szCs w:val="19"/>
               </w:rPr>
-              <w:t xml:space="preserve">£25/month or £250/year</w:t>
+              <w:t xml:space="preserve">£15/month or £150/year</w:t>
             </w:r>
           </w:p>
         </w:tc>
@@ -2545,7 +2545,7 @@
                 <w:sz w:val="19"/>
                 <w:szCs w:val="19"/>
               </w:rPr>
-              <w:t xml:space="preserve">£59/month or £590/year</w:t>
+              <w:t xml:space="preserve">£29/month or £290/year</w:t>
             </w:r>
           </w:p>
         </w:tc>
@@ -2614,7 +2614,7 @@
                 <w:sz w:val="19"/>
                 <w:szCs w:val="19"/>
               </w:rPr>
-              <w:t xml:space="preserve">£99/month or £990/year</w:t>
+              <w:t xml:space="preserve">£49/month or £490/year</w:t>
             </w:r>
           </w:p>
         </w:tc>
@@ -2683,7 +2683,7 @@
                 <w:sz w:val="19"/>
                 <w:szCs w:val="19"/>
               </w:rPr>
-              <w:t xml:space="preserve">£119/month or £1,190/year</w:t>
+              <w:t xml:space="preserve">£59/month or £590/year</w:t>
             </w:r>
           </w:p>
         </w:tc>
@@ -2705,7 +2705,7 @@
                 <w:sz w:val="19"/>
                 <w:szCs w:val="19"/>
               </w:rPr>
-              <w:t xml:space="preserve">Up to 2 parents: named doctor coordinator, scheduled doctor review, quarterly report. Extra parent: +£39/month or +£390/year</w:t>
+              <w:t xml:space="preserve">Up to 2 parents: named doctor coordinator, scheduled doctor review, quarterly report. Extra parent: +£19/month or +£190/year</w:t>
             </w:r>
           </w:p>
         </w:tc>
@@ -2752,7 +2752,7 @@
                 <w:sz w:val="19"/>
                 <w:szCs w:val="19"/>
               </w:rPr>
-              <w:t xml:space="preserve">£590/year</w:t>
+              <w:t xml:space="preserve">£290/year</w:t>
             </w:r>
           </w:p>
         </w:tc>
@@ -2774,7 +2774,7 @@
                 <w:sz w:val="19"/>
                 <w:szCs w:val="19"/>
               </w:rPr>
-              <w:t xml:space="preserve">Up to 4 people, monitoring matched to each member. Extra member: +£120/year</w:t>
+              <w:t xml:space="preserve">Up to 4 people, monitoring matched to each member. Extra member: +£60/year</w:t>
             </w:r>
           </w:p>
         </w:tc>
@@ -2821,7 +2821,7 @@
                 <w:sz w:val="19"/>
                 <w:szCs w:val="19"/>
               </w:rPr>
-              <w:t xml:space="preserve">£890/year</w:t>
+              <w:t xml:space="preserve">£430/year</w:t>
             </w:r>
           </w:p>
         </w:tc>
@@ -2843,7 +2843,7 @@
                 <w:sz w:val="19"/>
                 <w:szCs w:val="19"/>
               </w:rPr>
-              <w:t xml:space="preserve">Adds a named family doctor coordinator, priority escalation for all, one Annual Health Check/year. Extra member: +£160/year</w:t>
+              <w:t xml:space="preserve">Adds a named family doctor coordinator, priority escalation for all, one Annual Health Check/year. Extra member: +£80/year</w:t>
             </w:r>
           </w:p>
         </w:tc>
@@ -2890,7 +2890,7 @@
                 <w:sz w:val="19"/>
                 <w:szCs w:val="19"/>
               </w:rPr>
-              <w:t xml:space="preserve">£1,390/year</w:t>
+              <w:t xml:space="preserve">£620/year</w:t>
             </w:r>
           </w:p>
         </w:tc>
@@ -2912,7 +2912,7 @@
                 <w:sz w:val="19"/>
                 <w:szCs w:val="19"/>
               </w:rPr>
-              <w:t xml:space="preserve">Adds a scheduled monthly doctor appointment per member, quarterly reports, expedited response, two Annual Health Checks/year. Extra member: +£250/year</w:t>
+              <w:t xml:space="preserve">Adds a scheduled monthly doctor appointment per member, quarterly reports, expedited response, two Annual Health Checks/year. Extra member: +£120/year</w:t>
             </w:r>
           </w:p>
         </w:tc>
@@ -2928,7 +2928,15 @@
           <w:iCs/>
           <w:color w:val="555555"/>
         </w:rPr>
-        <w:t xml:space="preserve">US Dollar equivalents (in-app): Essential $34/mo, Complete $79/mo, ParentCare $159/mo, Family Lite $790/yr, Family Plus $1,190/yr, Family Premium $1,890/yr. Families larger than 6 people, or anything unusual — message our team for a custom quote.</w:t>
+        <w:t xml:space="preserve">US Dollar equivalents (in-app): Essential $19/mo, Complete $39/mo, ParentCare $79/mo, Family Lite $390/yr, Family Plus $570/yr, Family Premium $820/yr. Families larger than 6 people, or anything unusual — message our team for a custom quote.</w:t>
+      </w:r>
+    </w:p>
+    <w:p>
+      <w:pPr>
+        <w:spacing w:after="120"/>
+      </w:pPr>
+      <w:r>
+        <w:t xml:space="preserve">Being upfront: these plans are built first for watching over someone in Nigeria. If you subscribe for yourself while living abroad, the app tracking, doctor review of your readings, WhatsApp access, and health record all work wherever you are — but lab bookings, medication refills, and home visits happen through our partner network in Nigeria, so those are for when you're home.</w:t>
       </w:r>
     </w:p>
     <w:p>
@@ -4023,7 +4031,20 @@
         <w:spacing w:after="80"/>
       </w:pPr>
       <w:r>
-        <w:t xml:space="preserve">Diaspora Family plans are now real self-service tiers (Lite £590 / Plus £890 / Premium £1,390 per year) instead of quote-only</w:t>
+        <w:t xml:space="preserve">Diaspora Family plans are now real self-service tiers instead of quote-only</w:t>
+      </w:r>
+    </w:p>
+    <w:p>
+      <w:pPr>
+        <w:pStyle w:val="ListParagraph"/>
+        <w:numPr>
+          <w:ilvl w:val="0"/>
+          <w:numId w:val="2"/>
+        </w:numPr>
+        <w:spacing w:after="80"/>
+      </w:pPr>
+      <w:r>
+        <w:t xml:space="preserve">The entire diaspora price book was rebased roughly 50% lower (Essential £15/mo, Complete £29/mo, ParentCare £59/mo for 2 parents, Family Lite £290 / Plus £430 / Premium £620 per year): the care is delivered to the person in Nigeria, and a young platform earns trust with fair prices first</w:t>
       </w:r>
     </w:p>
     <w:p>

</xml_diff>